<commit_message>
feat(console): add customer management section and error handling pages
- Introduced a new "Customers" section in the console navigation, allowing support agents to view customer profiles and their interactions.
- Added error handling pages for better user experience when encountering issues:
  - Custom error page for general application errors.
  - Not found page for invalid routes.
- Implemented a global error handler for unhandled exceptions.
- Enhanced the copy module with new error messages and customer-related text.
- Created a new CSS module for consistent styling of error and not found pages.
- Developed backend functionality to retrieve customer profiles and histories, including conversations, tickets, and escalations.
- Updated database schema to support storing offered callback slots for conversations.
- Adjusted existing tools to utilize the new customer data and improve callback slot management.
</commit_message>
<xml_diff>
--- a/docs/RelayPay-Support-Agent-one-pager.docx
+++ b/docs/RelayPay-Support-Agent-one-pager.docx
@@ -74,7 +74,7 @@
           <w:rFonts w:ascii="Segoe UI" w:hAnsi="Segoe UI" w:cs="Segoe UI"/>
           <w:lang w:val="en"/>
         </w:rPr>
-        <w:t xml:space="preserve"> 1 October 2026    </w:t>
+        <w:t xml:space="preserve"> 2 October 2026    </w:t>
       </w:r>
       <w:r>
         <w:rPr>
@@ -527,7 +527,7 @@
           <w:szCs w:val="19"/>
           <w:lang w:val="en"/>
         </w:rPr>
-        <w:t xml:space="preserve"> Overview shows the week, Escalations who to call, when and why, and Conversations every reply with what was checked first.</w:t>
+        <w:t xml:space="preserve"> Overview shows the week, Escalations who to call, when and why, Conversations every reply with what was checked first, and Customers who each caller was and their history.</w:t>
       </w:r>
     </w:p>
     <w:p>
@@ -603,7 +603,7 @@
           <w:szCs w:val="19"/>
           <w:lang w:val="en"/>
         </w:rPr>
-        <w:t>Identity is two matching facts, not authentication; production would send a one-time code. English only. The seed data is static and dated. A fresh agent process starts every turn: replies averaged 4.6 to 6.3 seconds on live calls (Vapi's measurement), and the booking turn can pass the 14 second limit, when the caller hears what was already done. No phone number: Vapi's free numbers are US only. AI cost is an estimate, never added to Vapi's bill.</w:t>
+        <w:t>Identity is two matching facts, not authentication; production would send a one-time code. English only. The seed data is static and dated. A fresh agent process starts every turn: replies averaged 4.6 to 6.3 seconds on live calls (Vapi's measurement), and a turn that passes the 14 second limit still says what was already done. No phone number: Vapi's free numbers are US only. AI cost is an estimate, never added to Vapi's bill.</w:t>
       </w:r>
     </w:p>
     <w:p>
@@ -846,9 +846,9 @@
 <file path=word/numbering.xml><?xml version="1.0" encoding="utf-8"?>
 <w:numbering xmlns:wpc="http://schemas.microsoft.com/office/word/2010/wordprocessingCanvas" xmlns:cx="http://schemas.microsoft.com/office/drawing/2014/chartex" xmlns:cx1="http://schemas.microsoft.com/office/drawing/2015/9/8/chartex" xmlns:cx2="http://schemas.microsoft.com/office/drawing/2015/10/21/chartex" xmlns:cx3="http://schemas.microsoft.com/office/drawing/2016/5/9/chartex" xmlns:cx4="http://schemas.microsoft.com/office/drawing/2016/5/10/chartex" xmlns:cx5="http://schemas.microsoft.com/office/drawing/2016/5/11/chartex" xmlns:cx6="http://schemas.microsoft.com/office/drawing/2016/5/12/chartex" xmlns:cx7="http://schemas.microsoft.com/office/drawing/2016/5/13/chartex" xmlns:cx8="http://schemas.microsoft.com/office/drawing/2016/5/14/chartex" xmlns:mc="http://schemas.openxmlformats.org/markup-compatibility/2006" xmlns:aink="http://schemas.microsoft.com/office/drawing/2016/ink" xmlns:am3d="http://schemas.microsoft.com/office/drawing/2017/model3d" xmlns:o="urn:schemas-microsoft-com:office:office" xmlns:oel="http://schemas.microsoft.com/office/2019/extlst" xmlns:r="http://schemas.openxmlformats.org/officeDocument/2006/relationships" xmlns:m="http://schemas.openxmlformats.org/officeDocument/2006/math" xmlns:v="urn:schemas-microsoft-com:vml" xmlns:wp14="http://schemas.microsoft.com/office/word/2010/wordprocessingDrawing" xmlns:wp="http://schemas.openxmlformats.org/drawingml/2006/wordprocessingDrawing" xmlns:w10="urn:schemas-microsoft-com:office:word" xmlns:w="http://schemas.openxmlformats.org/wordprocessingml/2006/main" xmlns:w14="http://schemas.microsoft.com/office/word/2010/wordml" xmlns:w15="http://schemas.microsoft.com/office/word/2012/wordml" xmlns:w16cex="http://schemas.microsoft.com/office/word/2018/wordml/cex" xmlns:w16cid="http://schemas.microsoft.com/office/word/2016/wordml/cid" xmlns:w16="http://schemas.microsoft.com/office/word/2018/wordml" xmlns:w16du="http://schemas.microsoft.com/office/word/2023/wordml/word16du" xmlns:w16sdtdh="http://schemas.microsoft.com/office/word/2020/wordml/sdtdatahash" xmlns:w16sdtfl="http://schemas.microsoft.com/office/word/2024/wordml/sdtformatlock" xmlns:w16se="http://schemas.microsoft.com/office/word/2015/wordml/symex" xmlns:wpg="http://schemas.microsoft.com/office/word/2010/wordprocessingGroup" xmlns:wpi="http://schemas.microsoft.com/office/word/2010/wordprocessingInk" xmlns:wne="http://schemas.microsoft.com/office/word/2006/wordml" xmlns:wps="http://schemas.microsoft.com/office/word/2010/wordprocessingShape" mc:Ignorable="w14 w15 w16se w16cid w16 w16cex w16sdtdh w16sdtfl w16du wp14">
   <w:abstractNum w:abstractNumId="0" w15:restartNumberingAfterBreak="0">
-    <w:nsid w:val="462A6FD3"/>
+    <w:nsid w:val="0D953394"/>
     <w:multiLevelType w:val="multilevel"/>
-    <w:tmpl w:val="706441F2"/>
+    <w:tmpl w:val="CC3EF538"/>
     <w:lvl w:ilvl="0">
       <w:start w:val="1"/>
       <w:numFmt w:val="decimal"/>
@@ -958,7 +958,7 @@
       </w:pPr>
     </w:lvl>
   </w:abstractNum>
-  <w:num w:numId="1" w16cid:durableId="423383885">
+  <w:num w:numId="1" w16cid:durableId="322317034">
     <w:abstractNumId w:val="0"/>
   </w:num>
 </w:numbering>

</xml_diff>